<commit_message>
docs: checkpoint G02 content confidence
</commit_message>
<xml_diff>
--- a/competition/PolyNexus_Cyber4_Initial_Proposal_Draft_v0.2.docx
+++ b/competition/PolyNexus_Cyber4_Initial_Proposal_Draft_v0.2.docx
@@ -25,7 +25,7 @@
           <w:b/>
           <w:sz w:val="28"/>
         </w:rPr>
-        <w:t>初審提案計畫書（Draft v0.2）</w:t>
+        <w:t>初審提案計畫書（Content Confidence Draft v0.3）</w:t>
       </w:r>
     </w:p>
     <w:p>
@@ -76,7 +76,7 @@
           <w:b w:val="0"/>
           <w:sz w:val="28"/>
         </w:rPr>
-        <w:t>文件日期：2026 年 8 月 17 日</w:t>
+        <w:t>文件日期：2026 年 8 月 27 日</w:t>
       </w:r>
     </w:p>
     <w:p>
@@ -89,7 +89,7 @@
           <w:b w:val="0"/>
           <w:sz w:val="28"/>
         </w:rPr>
-        <w:t>初審最新通知截止日：2026 年 9 月 7 日</w:t>
+        <w:t>初審書審資料截止：2026 年 8 月 31 日（官方活動簡章；現行表單／公告覆蓋規則待 G03 確認）</w:t>
       </w:r>
     </w:p>
     <w:p>
@@ -102,7 +102,7 @@
           <w:b w:val="0"/>
           <w:sz w:val="28"/>
         </w:rPr>
-        <w:t>註：本文件為初審準備 Draft；功能完成狀態與未來 V1 規劃會明確區分，不以規劃項目宣稱已完成。</w:t>
+        <w:t>註：本文件為內容可信度 Draft v0.3；所有能力明確區分 Implemented / In Development / Planned V1 / Future。官方首頁與活動簡章已確認初審日期基線、20 頁上限與 50/30/20 評分；首頁 Demo 5–10 分鐘與簡章初選 Demo 3 分鐘內或截圖、效益說明表交件方式仍有 OFFICIAL_CONFLICT / NEED_ACTION，現行表單欄位／檔案限制待 G03 確認。不以規劃項目、歷史測試或 AI Opinion 宣稱已完成。</w:t>
       </w:r>
     </w:p>
     <w:p>
@@ -166,7 +166,7 @@
           <w:b w:val="0"/>
           <w:sz w:val="28"/>
         </w:rPr>
-        <w:t>企業與個人在日常工作中已同時使用 ChatGPT、Claude、Gemini、Codex、OpenCode 與 Local AI，但各工具彼此孤立，使用者必須重複搬運工作脈絡、人工比較答案與整理結果；更大的問題是 AI 的判斷常與真實測試、文件規則或人工核准混在一起，造成結果難以追溯、驗證與接續。PolyNexus 提出 Local-first 的多 AI 協作與驗證 Workspace，透過 Project、Task 與 Workflow 統一管理 Context、Artifact、Council、Evidence 與 Decision，讓不同 AI 先獨立分析、再交叉審查，重要結果再由真實工具或規則產生 Evidence。第一階段提供 Discuss、Review、Validate 三種工作入口，深度整合 Codex 與 OpenCode，並納入 ChatGPT、Claude、Gemini Web 與 LM Studio、Ollama 等 Local AI。系統採可替換 Adapter、Declarative Workflow、資料分級與 Local-only Policy，避免與單一 AI 綁定。初期以工程 Review 與 Release Validation 為主要落地場景，再延伸至需求、SOP、文件與主管方案比較，目標降低重複操作與整理成本、提升品質與可驗證性，並建立可由個人持續演進、未來可配合部門推廣的 AI 工作平台。</w:t>
+        <w:t>企業與個人在日常工作中同時使用多種 AI 與 runtime，但工具彼此孤立，使用者必須重複搬運脈絡、比較答案與整理結果；更大的問題是 AI 判斷常與真實測試、文件規則或人工核准混在一起，造成結果難以追溯、驗證與接續。PolyNexus 以 Local-first 為原則，提供 Project／Task／Run／Context Package／Artifact／History 的 bounded Workspace，以及 Council、Evidence、Finding、Decision 與 declarative Workflow 的協作與驗證基礎。當前可對外主張的是已接受的 Core slice：Project → Review → Runtime boundary → Finding／Evidence → Result → History。Codex／OpenCode vendor runtime、Web AI Level 3A、Local AI adapter、完整 routing policy、完整 V1 template breadth、完整 backup／restore 與 business outcome measurement 仍屬 In Development 或 Planned V1；dynamic marketplace、multi-user／enterprise IAM、full RAG 與 autonomous team 屬於 Future。</w:t>
       </w:r>
     </w:p>
     <w:p>
@@ -287,7 +287,7 @@
           <w:b w:val="0"/>
           <w:sz w:val="28"/>
         </w:rPr>
-        <w:t>PolyNexus 不再建立另一個模型，而是位於 Model / Agent Runtime 之上的 Coordination Plane。使用者以 Project / Workspace 為單位管理工作，並以 Discuss、Review、Validate 三種意圖啟動可重複 Workflow。</w:t>
+        <w:t>PolyNexus 不再建立另一個模型，而是位於 Model / Agent Runtime 之上的 Coordination Plane。現階段以 Project / Workspace 管理工作，並以 Discuss、Review、Validate 三種意圖啟動可重複 Workflow；已完成範圍為 bounded Core/API 與驗證基礎，vendor、browser、local integration 依 maturity separately gated。</w:t>
       </w:r>
     </w:p>
     <w:p>
@@ -389,7 +389,7 @@
                 <w:rFonts w:ascii="DFKai-SB" w:hAnsi="DFKai-SB" w:eastAsia="標楷體"/>
                 <w:sz w:val="24"/>
               </w:rPr>
-              <w:t>Project、Task、Context Package、Artifact、History</w:t>
+              <w:t>IMPLEMENTED（bounded）：Project、Task、Context Package、Artifact、History</w:t>
             </w:r>
           </w:p>
         </w:tc>
@@ -436,7 +436,7 @@
                 <w:rFonts w:ascii="DFKai-SB" w:hAnsi="DFKai-SB" w:eastAsia="標楷體"/>
                 <w:sz w:val="24"/>
               </w:rPr>
-              <w:t>獨立分析、Cross Review、Synthesis</w:t>
+              <w:t>IMPLEMENTED（WP-12 bounded）：獨立分析、Cross Review、Synthesis</w:t>
             </w:r>
           </w:p>
         </w:tc>
@@ -483,7 +483,7 @@
                 <w:rFonts w:ascii="DFKai-SB" w:hAnsi="DFKai-SB" w:eastAsia="標楷體"/>
                 <w:sz w:val="24"/>
               </w:rPr>
-              <w:t>區分 AI Opinion / Tool / Runtime / Document / Human Evidence</w:t>
+              <w:t>IMPLEMENTED（WP-13 bounded）：區分 AI Opinion / Tool / Runtime / Document / Human Evidence；Human decision fail closed</w:t>
             </w:r>
           </w:p>
         </w:tc>
@@ -530,7 +530,7 @@
                 <w:rFonts w:ascii="DFKai-SB" w:hAnsi="DFKai-SB" w:eastAsia="標楷體"/>
                 <w:sz w:val="24"/>
               </w:rPr>
-              <w:t>Declarative fixed-node Workflow + Built-in Templates</w:t>
+              <w:t>IMPLEMENTED（bounded）：Declarative fixed-node Workflow；目前 3 個 Built-in；完整 breadth planned</w:t>
             </w:r>
           </w:p>
         </w:tc>
@@ -577,7 +577,7 @@
                 <w:rFonts w:ascii="DFKai-SB" w:hAnsi="DFKai-SB" w:eastAsia="標楷體"/>
                 <w:sz w:val="24"/>
               </w:rPr>
-              <w:t>Codex / OpenCode 深度整合；其他分成熟度</w:t>
+              <w:t>IN DEVELOPMENT：Runtime Registry / Adapter / Reference lifecycle；Codex／OpenCode real CLI、network、credentials、production 未宣稱</w:t>
             </w:r>
           </w:p>
         </w:tc>
@@ -624,7 +624,7 @@
                 <w:rFonts w:ascii="DFKai-SB" w:hAnsi="DFKai-SB" w:eastAsia="標楷體"/>
                 <w:sz w:val="24"/>
               </w:rPr>
-              <w:t>ChatGPT / Claude / Gemini Level 3A + fallback</w:t>
+              <w:t>IN DEVELOPMENT：MV3 thin companion；drivers current DEGRADED；Level 3A 尚未宣稱</w:t>
             </w:r>
           </w:p>
         </w:tc>
@@ -671,7 +671,7 @@
                 <w:rFonts w:ascii="DFKai-SB" w:hAnsi="DFKai-SB" w:eastAsia="標楷體"/>
                 <w:sz w:val="24"/>
               </w:rPr>
-              <w:t>LM Studio / Ollama / Generic endpoint</w:t>
+              <w:t>PLANNED V1：LM Studio / Ollama / Generic endpoint；current adapter evidence 不足</w:t>
             </w:r>
           </w:p>
         </w:tc>
@@ -718,7 +718,7 @@
                 <w:rFonts w:ascii="DFKai-SB" w:hAnsi="DFKai-SB" w:eastAsia="標楷體"/>
                 <w:sz w:val="24"/>
               </w:rPr>
-              <w:t>資料分類、Local-only、Assurance、Audit</w:t>
+              <w:t>PLANNED V1：classification / routing / local-only policy target；D11 gate 保留 fail-closed Human decision boundary</w:t>
             </w:r>
           </w:p>
         </w:tc>
@@ -762,7 +762,7 @@
           <w:rFonts w:ascii="DFKai-SB" w:hAnsi="DFKai-SB" w:eastAsia="標楷體"/>
           <w:sz w:val="28"/>
         </w:rPr>
-        <w:t>● Coding Agent Runtime：以 Codex、OpenCode 作為 V1 深度 Runtime，透過 Core-owned Run Supervisor 統一 Health、Run、Status、Result、Timeout、Cancel、Evidence、Cleanup 等 Contract；vendor-specific 邏輯只留在 Adapter。</w:t>
+        <w:t>● Coding Agent Runtime：Reference Adapter、Run Supervisor 與 Registry boundary 已有 bounded evidence；Codex／OpenCode real CLI、network、credentials、production integration 為 IN DEVELOPMENT，不宣稱完成。</w:t>
       </w:r>
     </w:p>
     <w:p>
@@ -774,7 +774,7 @@
           <w:rFonts w:ascii="DFKai-SB" w:hAnsi="DFKai-SB" w:eastAsia="標楷體"/>
           <w:sz w:val="28"/>
         </w:rPr>
-        <w:t>● Web AI Surface：ChatGPT、Claude、Gemini 採 Assisted Automation；Auto Fill 後由使用者確認送出，並提供 Clipboard / Manual fallback，避免 Web UI 改版造成整個系統失效。</w:t>
+        <w:t>● Web AI Surface：ChatGPT、Claude、Gemini 的 MV3 thin companion 為 IN DEVELOPMENT；driver 目前 DEGRADED。Auto Fill、user-confirmed send、capture/normalize 與 browser E2E 尚未宣稱完成；fallback 是設計目標。</w:t>
       </w:r>
     </w:p>
     <w:p>
@@ -786,7 +786,7 @@
           <w:rFonts w:ascii="DFKai-SB" w:hAnsi="DFKai-SB" w:eastAsia="標楷體"/>
           <w:sz w:val="28"/>
         </w:rPr>
-        <w:t>● Local AI：透過 OpenAI-compatible baseline 支援 LM Studio、Ollama 與 Generic Endpoint；能力按 Endpoint + Model 宣告。</w:t>
+        <w:t>● Local AI：LM Studio、Ollama 與 Generic Endpoint 為 PLANNED V1；OpenAI-compatible baseline 是規劃方向，current adapter／endpoint evidence 尚不足。</w:t>
       </w:r>
     </w:p>
     <w:p>
@@ -798,7 +798,7 @@
           <w:rFonts w:ascii="DFKai-SB" w:hAnsi="DFKai-SB" w:eastAsia="標楷體"/>
           <w:sz w:val="28"/>
         </w:rPr>
-        <w:t>● Workflow：以 YAML Authoring + Schema Validation + Canonical Model 建立小型 Declarative Workflow；AI 是 Workflow Node，不是系統 Owner，重要 PASS 由 Workflow Hard Gate Evidence 決定。</w:t>
+        <w:t>● Workflow：以 YAML Authoring、Schema Validation、Canonical Model 與 Workflow Hard Gate Evidence 建立 bounded Declarative Workflow；目前可追溯 3 個 Built-in，AI 不是系統 Owner，完整 template breadth 為 PLANNED V1。</w:t>
       </w:r>
     </w:p>
     <w:p>
@@ -810,7 +810,7 @@
           <w:rFonts w:ascii="DFKai-SB" w:hAnsi="DFKai-SB" w:eastAsia="標楷體"/>
           <w:sz w:val="28"/>
         </w:rPr>
-        <w:t>● Data Routing：PUBLIC / INTERNAL / CONFIDENTIAL / RESTRICTED；敏感資料 Local failure 不得 silent cloud fallback。</w:t>
+        <w:t>● Data Routing：PUBLIC / INTERNAL / CONFIDENTIAL / RESTRICTED 與敏感資料不得 silent cloud fallback 是 PLANNED V1 policy target；current runtime 不宣稱已具完整 egress enforcement。</w:t>
       </w:r>
     </w:p>
     <w:p>
@@ -822,7 +822,7 @@
           <w:rFonts w:ascii="DFKai-SB" w:hAnsi="DFKai-SB" w:eastAsia="標楷體"/>
           <w:sz w:val="28"/>
         </w:rPr>
-        <w:t>● Extension：V1 採 Plugin-ready static architecture，先做 Contract / Manifest / Registry / Conformance；Browser Companion 採 Chrome MV3 Thin Companion，不把 Web DOM 邏輯放進 Core。</w:t>
+        <w:t>● Extension：目前是 Plugin-ready static architecture、Contract / Manifest / Registry / Conformance foundation；Browser Companion 採 Chrome MV3 Thin Companion，不把 Web DOM 邏輯放進 Core。dynamic marketplace、remote install、signing、auto-update 為 FUTURE。</w:t>
       </w:r>
     </w:p>
     <w:p>
@@ -845,7 +845,7 @@
           <w:b w:val="0"/>
           <w:sz w:val="28"/>
         </w:rPr>
-        <w:t>PolyNexus 的創新不是「同時問更多 AI」，而是將多 AI 使用從個人聊天行為提升成具有 Workflow、Cross Review、Evidence、Assurance 與 History 的可驗證工作方式。平台同時保留個人使用彈性：一般任務可採 Flexible；正式交付才要求 Verified。</w:t>
+        <w:t>PolyNexus 的創新不是「同時問更多 AI」，而是將多 AI 使用從個人聊天行為提升成具有 Workflow、Cross Review、Evidence、Assurance 與 History 的可驗證工作方式。現階段可主張的是 bounded Core／gate foundation；一般任務可採 Flexible，正式交付的 Verified 仍須依 deterministic evidence 與 Human decision boundary fail closed。</w:t>
       </w:r>
     </w:p>
     <w:p>
@@ -881,7 +881,7 @@
           <w:b w:val="0"/>
           <w:sz w:val="28"/>
         </w:rPr>
-        <w:t>Human → React/TypeScript/Vite Local Web UI → REST/WebSocket → Python/FastAPI Core → Workspace / Workflow / Council / Evidence / Policy / Run Supervisor → Runtime Adapter / Local Model Endpoint / Chrome MV3 Web Surface Driver / Tool Connector。V1 metadata 使用 SQLite，Artifact 使用 filesystem；Secret 僅以 SecretRef 進 Domain，實際值由 OS-backed SecretStore 管理。</w:t>
+        <w:t>Human → React/TypeScript/Vite Local Web UI → REST/WebSocket → Python/FastAPI Core → Workspace / Workflow / Council / Evidence / Policy / Run Supervisor → Runtime Adapter / Local Model Endpoint / Chrome MV3 Web Surface Driver / Tool Connector。這是架構 target；目前 evidence 只支持 bounded Core、reference runtime 與 contract boundary。V1 metadata 使用 SQLite，Artifact 使用 filesystem；Secret 僅以 SecretRef 進 Domain，實際值由 OS-backed SecretStore 管理。</w:t>
       </w:r>
     </w:p>
     <w:p>
@@ -991,7 +991,7 @@
           <w:rFonts w:ascii="DFKai-SB" w:hAnsi="DFKai-SB" w:eastAsia="標楷體"/>
           <w:sz w:val="28"/>
         </w:rPr>
-        <w:t>● Local AI 測試可使用 LM Studio / Ollama；雲端 Web AI 使用既有合法帳號。</w:t>
+        <w:t>● Local AI 測試資源可規劃使用 LM Studio / Ollama；目前 adapter evidence 仍為 PLANNED V1。雲端 Web AI integration 仍依 driver maturity 與合法授權分開驗證。</w:t>
       </w:r>
     </w:p>
     <w:p>
@@ -1039,7 +1039,7 @@
           <w:b w:val="0"/>
           <w:sz w:val="28"/>
         </w:rPr>
-        <w:t>PolyNexus 將現有分散的 AI 使用方式統一成可重複 Workflow。對工程可降低多工具切換、Code Review 整理與驗收報告製作成本；對 PM、行政與主管，可將不同 AI 的回答轉成 Consensus、Disagreement、Risk、Missing Information 與 Decision。</w:t>
+        <w:t>PolyNexus 目標將分散的 AI 使用方式統一成可重複 Workflow。對工程可量測多工具切換、Code Review 整理與驗收報告成本；對 PM、行政與主管，Consensus、Disagreement、Risk、Missing Information 與 Decision 是延伸使用情境，不是本版已完成的完整企業流程。</w:t>
       </w:r>
     </w:p>
     <w:p>
@@ -1106,7 +1106,7 @@
                 <w:rFonts w:ascii="DFKai-SB" w:hAnsi="DFKai-SB" w:eastAsia="標楷體"/>
                 <w:sz w:val="24"/>
               </w:rPr>
-              <w:t>V1 目標用法</w:t>
+              <w:t>規劃用法（非實測）</w:t>
             </w:r>
           </w:p>
         </w:tc>
@@ -1399,7 +1399,7 @@
           <w:rFonts w:ascii="DFKai-SB" w:hAnsi="DFKai-SB" w:eastAsia="標楷體"/>
           <w:sz w:val="28"/>
         </w:rPr>
-        <w:t>● 2026/08/25：提案與 AI Use Case 簡報內容 v1，可進行內部 Review。</w:t>
+        <w:t>● 2026/08/25：提案與 AI Use Case 簡報內容 v1 為 internal planning version；G02 補充 content-confidence matrix。</w:t>
       </w:r>
     </w:p>
     <w:p>
@@ -1411,7 +1411,7 @@
           <w:rFonts w:ascii="DFKai-SB" w:hAnsi="DFKai-SB" w:eastAsia="標楷體"/>
           <w:sz w:val="28"/>
         </w:rPr>
-        <w:t>● 2026/09/07：依最新通知完成初審文件上傳。</w:t>
+        <w:t>● 2026/08/31：official brief initial-review document deadline；2026/09/01–09/24 initial review；2026/09/30 result notification。Repository 2026/09/07 僅為歷史 planning record；current form／announcement override 仍需 G03 確認，不代表已授權上傳。</w:t>
       </w:r>
     </w:p>
     <w:p>
@@ -1423,7 +1423,7 @@
           <w:rFonts w:ascii="DFKai-SB" w:hAnsi="DFKai-SB" w:eastAsia="標楷體"/>
           <w:sz w:val="28"/>
         </w:rPr>
-        <w:t>● 2026/09/20：Core Product（Discuss/Review/Validate、Council、Evidence、Codex/OpenCode）主要路徑完成。</w:t>
+        <w:t>● 2026/09/20：Core Product 主要路徑 roadmap target；不代表 G02 當前已完成 Codex／OpenCode real runtime。</w:t>
       </w:r>
     </w:p>
     <w:p>
@@ -1435,7 +1435,7 @@
           <w:rFonts w:ascii="DFKai-SB" w:hAnsi="DFKai-SB" w:eastAsia="標楷體"/>
           <w:sz w:val="28"/>
         </w:rPr>
-        <w:t>● 2026/10/04：Web AI、Local AI、Data Policy baseline 完成。</w:t>
+        <w:t>● 2026/10/04：Web AI、Local AI、Data Policy baseline roadmap target；目前分屬 IN DEVELOPMENT／PLANNED V1。</w:t>
       </w:r>
     </w:p>
     <w:p>
@@ -1447,7 +1447,7 @@
           <w:rFonts w:ascii="DFKai-SB" w:hAnsi="DFKai-SB" w:eastAsia="標楷體"/>
           <w:sz w:val="28"/>
         </w:rPr>
-        <w:t>● 2026/10/18：V1 Feature Freeze。</w:t>
+        <w:t>● 2026/10/18：V1 Feature Freeze planned milestone。</w:t>
       </w:r>
     </w:p>
     <w:p>
@@ -1459,7 +1459,7 @@
           <w:rFonts w:ascii="DFKai-SB" w:hAnsi="DFKai-SB" w:eastAsia="標楷體"/>
           <w:sz w:val="28"/>
         </w:rPr>
-        <w:t>● 2026/10/31：V1 Development + Acceptance Complete，目標為可長期個人使用的 Personal V1 Release Candidate。</w:t>
+        <w:t>● 2026/10/31：V1 Development + Acceptance Complete 是 roadmap target；仍需實際 deterministic evidence、independent review 與 Human acceptance。</w:t>
       </w:r>
     </w:p>
     <w:p>
@@ -1484,7 +1484,7 @@
           <w:rFonts w:ascii="DFKai-SB" w:hAnsi="DFKai-SB" w:eastAsia="標楷體"/>
           <w:sz w:val="28"/>
         </w:rPr>
-        <w:t>● Web AI UI 改版：薄 Driver + manual fallback + failure isolation，不讓 Web 成為 Core 單點依賴。</w:t>
+        <w:t>● Web AI UI 改版：薄 Driver + manual fallback + failure isolation 是 IN DEVELOPMENT 設計方向；current drivers 為 DEGRADED。</w:t>
       </w:r>
     </w:p>
     <w:p>
@@ -1496,7 +1496,7 @@
           <w:rFonts w:ascii="DFKai-SB" w:hAnsi="DFKai-SB" w:eastAsia="標楷體"/>
           <w:sz w:val="28"/>
         </w:rPr>
-        <w:t>● Runtime 版本快速變動：Certified Version Matrix + Doctor + Conformance；Broad compatibility 不等於全部 Certified。</w:t>
+        <w:t>● Runtime 版本快速變動：Certified Version Matrix + Doctor + Conformance 是 development gate；reference foundation 不等於 real vendor runtime certified。</w:t>
       </w:r>
     </w:p>
     <w:p>
@@ -1544,7 +1544,7 @@
           <w:rFonts w:ascii="DFKai-SB" w:hAnsi="DFKai-SB" w:eastAsia="標楷體"/>
           <w:sz w:val="28"/>
         </w:rPr>
-        <w:t>● 資料外洩：Local-only route、egress policy、secret reference、競賽只用 synthetic/public data。</w:t>
+        <w:t>● 資料外洩：Local-only route 與 egress policy 為 PLANNED V1 target；secret reference 與競賽 synthetic/public data boundary 已保留，不宣稱完整 policy enforcement。</w:t>
       </w:r>
     </w:p>
     <w:p>
@@ -1567,7 +1567,7 @@
           <w:b w:val="0"/>
           <w:sz w:val="28"/>
         </w:rPr>
-        <w:t>第一階段先確保個人真的能持續使用，並從工程 Workflow 收集 Usage 與 Quality 指標。若證明有價值，再以同一套 Declarative Workflow / Adapter / Evidence Domain 增加部門 Template、Personal Hub、共享 Workflow 與公司 Policy；不需要為每個部門重新開發一套系統。</w:t>
+        <w:t>第一階段先確保個人真的能持續使用，並以工程 Workflow 規劃 Usage 與 Quality 指標。若後續 evidence 證明有價值，再以同一套 Declarative Workflow / Adapter / Evidence Domain 增加部門 Template、Personal Hub、共享 Workflow 與公司 Policy；department／enterprise rollout 是 evolution path，不是本版已交付能力。</w:t>
       </w:r>
     </w:p>
     <w:p>
@@ -1628,7 +1628,7 @@
           <w:rFonts w:ascii="DFKai-SB" w:hAnsi="DFKai-SB" w:eastAsia="標楷體"/>
           <w:sz w:val="28"/>
         </w:rPr>
-        <w:t>● 10 月完成後提供 Runtime Conformance、Release Validation Evidence、Compatibility Matrix、Known Limitations。</w:t>
+        <w:t>● 10 月 roadmap target：以實際 Runtime Conformance、Release Validation Evidence、Compatibility Matrix、Known Limitations 支持後續 acceptance；本版不提前宣稱完成。</w:t>
       </w:r>
     </w:p>
     <w:p>
@@ -1653,7 +1653,7 @@
           <w:b/>
           <w:sz w:val="28"/>
         </w:rPr>
-        <w:t>目前完成狀態（2026-08-17）</w:t>
+        <w:t>目前完成狀態（2026-08-27；content-confidence draft）</w:t>
       </w:r>
     </w:p>
     <w:p>
@@ -1663,7 +1663,7 @@
           <w:b w:val="0"/>
           <w:sz w:val="28"/>
         </w:rPr>
-        <w:t>已完成：產品定位、Scope Decisions D01–D10、V1 成熟度策略、ADR-001～010 技術架構 Freeze、Git / Shared Memory / Skills、PRD / SA / SD Development Baseline v1.0，以及可驗證的 React/FastAPI/MV3/Workflow Schema repository scaffold。</w:t>
+        <w:t>已接受／checkpointed bounded evidence：產品定位、Scope Decisions D01–D10、V1 成熟度策略、ADR-001～010 技術架構 Freeze、Git / Shared Memory / Skills、PRD / SA / SD Development Baseline v1.0，以及 React/FastAPI/MV3/Workflow Schema repository foundation；另有 WP-12 Council、WP-13 gate 與 reference runtime evidence，均依其 bounded scope 解讀。</w:t>
       </w:r>
     </w:p>
     <w:p>
@@ -1673,7 +1673,7 @@
           <w:b w:val="0"/>
           <w:sz w:val="28"/>
         </w:rPr>
-        <w:t>進行中：目標 Windows 環境 Baseline 驗證、競賽簡報與架構圖、First Vertical Slice（Project → Review → Runtime → Finding/Evidence → Result → History）。</w:t>
+        <w:t>進行中：目標 Windows 環境 Baseline 驗證、競賽簡報與架構圖、content-confidence review、Runtime Adapter conformance、以及 First Vertical Slice（Project → Review → Runtime → Finding/Evidence → Result → History）的後續 component gates。</w:t>
       </w:r>
     </w:p>
     <w:p>
@@ -1683,7 +1683,50 @@
           <w:b w:val="0"/>
           <w:sz w:val="28"/>
         </w:rPr>
-        <w:t>尚未宣稱完成：PolyNexus V1 主要產品功能、Codex/OpenCode 真實 Runtime Conformance、Web AI Level 3A、Local AI 與 9 個 Workflow Template；依 8–10 月 Roadmap 開發並以實際測試 Evidence 驗收。</w:t>
+        <w:t>尚未宣稱完成：完整 PolyNexus V1、Codex/OpenCode real CLI/network/credential/production runtime、Web AI Level 3A、Local AI adapter、完整 routing/egress enforcement、9 個 Workflow Template、完整 backup/restore、實測效益、Browser E2E、Windows symlink containment 與 true concurrent HTTP；這些依 maturity、roadmap 與實際 evidence 分別處理。</w:t>
+      </w:r>
+    </w:p>
+    <w:p>
+      <w:pPr>
+        <w:pStyle w:val="Heading1"/>
+      </w:pPr>
+      <w:r>
+        <w:rPr>
+          <w:rFonts w:ascii="DFKai-SB" w:hAnsi="DFKai-SB" w:eastAsia="標楷體"/>
+          <w:b/>
+          <w:sz w:val="28"/>
+        </w:rPr>
+        <w:t>六、內容可信度與官方要求查證</w:t>
+      </w:r>
+    </w:p>
+    <w:p>
+      <w:r>
+        <w:rPr>
+          <w:rFonts w:ascii="DFKai-SB" w:hAnsi="DFKai-SB" w:eastAsia="標楷體"/>
+          <w:b w:val="0"/>
+          <w:sz w:val="28"/>
+        </w:rPr>
+        <w:t>來源—claim matrix：competition/G02_SOURCE_TO_CLAIM_MATRIX.md；20 個產品 claim 已逐列標示 evidence、maturity、限制與修正說法。計數：IMPLEMENTED 8、IN DEVELOPMENT 3、PLANNED V1 5、FUTURE 4。</w:t>
+      </w:r>
+    </w:p>
+    <w:p>
+      <w:r>
+        <w:rPr>
+          <w:rFonts w:ascii="DFKai-SB" w:hAnsi="DFKai-SB" w:eastAsia="標楷體"/>
+          <w:b w:val="0"/>
+          <w:sz w:val="28"/>
+        </w:rPr>
+        <w:t>官方查證狀態：2026-08-27 以唯讀 Node fetch 取得官方首頁 HTTP 200；H1 為 2026 Cyber4.0 AI創新競賽，主辦單位為 Cyber4.0 推動任務小組，並取得初審表單連結。官方首頁與公開活動簡章已確認初審時程基線、20 頁上限與 50/30/20 評分；首頁 Demo 5–10 分鐘與簡章初選 Demo 3 分鐘內或截圖、效益說明表是否獨立交件仍為 OFFICIAL_CONFLICT / NEED_ACTION。本輪未登入、填寫、上傳或送出。</w:t>
+      </w:r>
+    </w:p>
+    <w:p>
+      <w:r>
+        <w:rPr>
+          <w:rFonts w:ascii="DFKai-SB" w:hAnsi="DFKai-SB" w:eastAsia="標楷體"/>
+          <w:b w:val="0"/>
+          <w:sz w:val="28"/>
+        </w:rPr>
+        <w:t>內容限制：Reference Runtime／Registry、Council、Evidence gate 只能按 bounded scope 描述。Real Codex/OpenCode execution、Web AI Level 3A、Local AI、完整 policy、Browser E2E、Windows symlink containment 與 true concurrent HTTP 不得寫成已完成；歷史測試與內部日期不替代 current evidence。</w:t>
       </w:r>
     </w:p>
     <w:p>
@@ -1706,7 +1749,7 @@
           <w:b w:val="0"/>
           <w:sz w:val="28"/>
         </w:rPr>
-        <w:t>Cyber4.0 AI Innovation Challenge 2026 活動網站：https://ai-challenge-2026.cybersoft.tw/</w:t>
+        <w:t>Cyber4.0 AI Innovation Challenge 2026 活動網站：https://ai-challenge-2026.cybersoft.tw/（2026-08-27 Node fetch HTTP 200；H1 與主辦單位已確認）；初審表單：https://forms.cloud.microsoft/r/e6PyFrYNR9</w:t>
       </w:r>
     </w:p>
     <w:p>
@@ -1716,7 +1759,7 @@
           <w:b w:val="0"/>
           <w:sz w:val="28"/>
         </w:rPr>
-        <w:t>最新初審通知：截止日 2026-09-07；最終附件格式與 Demo 規格以上傳表單／最新公告為準。</w:t>
+        <w:t>官方活動簡章：https://ai-challenge-2026.cybersoft.tw/assets/%E6%B4%BB%E5%8B%95%E7%B0%A1%E7%AB%A0.docx（HTTP 200；cover date 中華民國115年6月）：初審書審資料截止 2026.08.31；proposal 與 AI Use Case deck 各 20 頁上限；proposal 為 A4 直式、標楷體 12 級、1.0 倍行距並編列頁碼；初選 Demo 為 3 分鐘內或截圖。首頁 5–10 分鐘 Demo 與效益說明表交件方式衝突待 G03／Human 確認；2026-09-07 僅為 repository 歷史規劃日期。</w:t>
       </w:r>
     </w:p>
     <w:sectPr>

</xml_diff>